<commit_message>
Final Draft of Group Documentation
</commit_message>
<xml_diff>
--- a/Documentation for 1201 Project v2.docx
+++ b/Documentation for 1201 Project v2.docx
@@ -1,6 +1,6 @@
 
 <file path=word/document.xml><?xml version="1.0" encoding="utf-8"?>
-<w:document xmlns:wpc="http://schemas.microsoft.com/office/word/2010/wordprocessingCanvas" xmlns:cx="http://schemas.microsoft.com/office/drawing/2014/chartex" xmlns:cx1="http://schemas.microsoft.com/office/drawing/2015/9/8/chartex" xmlns:cx2="http://schemas.microsoft.com/office/drawing/2015/10/21/chartex" xmlns:cx3="http://schemas.microsoft.com/office/drawing/2016/5/9/chartex" xmlns:cx4="http://schemas.microsoft.com/office/drawing/2016/5/10/chartex" xmlns:cx5="http://schemas.microsoft.com/office/drawing/2016/5/11/chartex" xmlns:cx6="http://schemas.microsoft.com/office/drawing/2016/5/12/chartex" xmlns:cx7="http://schemas.microsoft.com/office/drawing/2016/5/13/chartex" xmlns:cx8="http://schemas.microsoft.com/office/drawing/2016/5/14/chartex" xmlns:mc="http://schemas.openxmlformats.org/markup-compatibility/2006" xmlns:aink="http://schemas.microsoft.com/office/drawing/2016/ink" xmlns:am3d="http://schemas.microsoft.com/office/drawing/2017/model3d" xmlns:o="urn:schemas-microsoft-com:office:office" xmlns:oel="http://schemas.microsoft.com/office/2019/extlst" xmlns:r="http://schemas.openxmlformats.org/officeDocument/2006/relationships" xmlns:m="http://schemas.openxmlformats.org/officeDocument/2006/math" xmlns:v="urn:schemas-microsoft-com:vml" xmlns:wp14="http://schemas.microsoft.com/office/word/2010/wordprocessingDrawing" xmlns:wp="http://schemas.openxmlformats.org/drawingml/2006/wordprocessingDrawing" xmlns:w10="urn:schemas-microsoft-com:office:word" xmlns:w="http://schemas.openxmlformats.org/wordprocessingml/2006/main" xmlns:w14="http://schemas.microsoft.com/office/word/2010/wordml" xmlns:w15="http://schemas.microsoft.com/office/word/2012/wordml" xmlns:w16cex="http://schemas.microsoft.com/office/word/2018/wordml/cex" xmlns:w16cid="http://schemas.microsoft.com/office/word/2016/wordml/cid" xmlns:w16="http://schemas.microsoft.com/office/word/2018/wordml" xmlns:w16du="http://schemas.microsoft.com/office/word/2023/wordml/word16du" xmlns:w16sdtdh="http://schemas.microsoft.com/office/word/2020/wordml/sdtdatahash" xmlns:w16sdtfl="http://schemas.microsoft.com/office/word/2024/wordml/sdtformatlock" xmlns:w16se="http://schemas.microsoft.com/office/word/2015/wordml/symex" xmlns:wpg="http://schemas.microsoft.com/office/word/2010/wordprocessingGroup" xmlns:wpi="http://schemas.microsoft.com/office/word/2010/wordprocessingInk" xmlns:wne="http://schemas.microsoft.com/office/word/2006/wordml" xmlns:wps="http://schemas.microsoft.com/office/word/2010/wordprocessingShape" mc:Ignorable="w14 w15 w16se w16cid w16 w16cex w16sdtdh w16sdtfl w16du wp14">
+<w:document xmlns:wpc="http://schemas.microsoft.com/office/word/2010/wordprocessingCanvas" xmlns:cx="http://schemas.microsoft.com/office/drawing/2014/chartex" xmlns:cx1="http://schemas.microsoft.com/office/drawing/2015/9/8/chartex" xmlns:cx2="http://schemas.microsoft.com/office/drawing/2015/10/21/chartex" xmlns:cx3="http://schemas.microsoft.com/office/drawing/2016/5/9/chartex" xmlns:cx4="http://schemas.microsoft.com/office/drawing/2016/5/10/chartex" xmlns:cx5="http://schemas.microsoft.com/office/drawing/2016/5/11/chartex" xmlns:cx6="http://schemas.microsoft.com/office/drawing/2016/5/12/chartex" xmlns:cx7="http://schemas.microsoft.com/office/drawing/2016/5/13/chartex" xmlns:cx8="http://schemas.microsoft.com/office/drawing/2016/5/14/chartex" xmlns:mc="http://schemas.openxmlformats.org/markup-compatibility/2006" xmlns:aink="http://schemas.microsoft.com/office/drawing/2016/ink" xmlns:am3d="http://schemas.microsoft.com/office/drawing/2017/model3d" xmlns:o="urn:schemas-microsoft-com:office:office" xmlns:oel="http://schemas.microsoft.com/office/2019/extlst" xmlns:r="http://schemas.openxmlformats.org/officeDocument/2006/relationships" xmlns:m="http://schemas.openxmlformats.org/officeDocument/2006/math" xmlns:v="urn:schemas-microsoft-com:vml" xmlns:wp14="http://schemas.microsoft.com/office/word/2010/wordprocessingDrawing" xmlns:wp="http://schemas.openxmlformats.org/drawingml/2006/wordprocessingDrawing" xmlns:w10="urn:schemas-microsoft-com:office:word" xmlns:w="http://schemas.openxmlformats.org/wordprocessingml/2006/main" xmlns:w14="http://schemas.microsoft.com/office/word/2010/wordml" xmlns:w15="http://schemas.microsoft.com/office/word/2012/wordml" xmlns:w16cex="http://schemas.microsoft.com/office/word/2018/wordml/cex" xmlns:w16cid="http://schemas.microsoft.com/office/word/2016/wordml/cid" xmlns:w16="http://schemas.microsoft.com/office/word/2018/wordml" xmlns:w16sdtdh="http://schemas.microsoft.com/office/word/2020/wordml/sdtdatahash" xmlns:w16se="http://schemas.microsoft.com/office/word/2015/wordml/symex" xmlns:wpg="http://schemas.microsoft.com/office/word/2010/wordprocessingGroup" xmlns:wpi="http://schemas.microsoft.com/office/word/2010/wordprocessingInk" xmlns:wne="http://schemas.microsoft.com/office/word/2006/wordml" xmlns:wps="http://schemas.microsoft.com/office/word/2010/wordprocessingShape" mc:Ignorable="w14 w15 w16se w16cid w16 w16cex w16sdtdh wp14">
   <w:body>
     <w:p>
       <w:pPr>
@@ -25,15 +25,15 @@
           <w:szCs w:val="28"/>
         </w:rPr>
         <w:drawing>
-          <wp:anchor distT="0" distB="0" distL="114300" distR="114300" simplePos="0" relativeHeight="251659264" behindDoc="1" locked="0" layoutInCell="1" allowOverlap="1" wp14:anchorId="056DEEFF" wp14:editId="5237FC47">
+          <wp:anchor distT="0" distB="0" distL="114300" distR="114300" simplePos="0" relativeHeight="251659264" behindDoc="1" locked="0" layoutInCell="1" allowOverlap="1" wp14:anchorId="056DEEFF" wp14:editId="0B3B06D3">
             <wp:simplePos x="0" y="0"/>
             <wp:positionH relativeFrom="margin">
               <wp:align>center</wp:align>
             </wp:positionH>
             <wp:positionV relativeFrom="paragraph">
-              <wp:posOffset>28575</wp:posOffset>
+              <wp:posOffset>-635</wp:posOffset>
             </wp:positionV>
-            <wp:extent cx="2266950" cy="1812749"/>
+            <wp:extent cx="2942159" cy="2352675"/>
             <wp:effectExtent l="0" t="0" r="0" b="0"/>
             <wp:wrapNone/>
             <wp:docPr id="813380467" name="Picture 1"/>
@@ -65,7 +65,7 @@
                   <pic:spPr bwMode="auto">
                     <a:xfrm>
                       <a:off x="0" y="0"/>
-                      <a:ext cx="2266950" cy="1812749"/>
+                      <a:ext cx="2942159" cy="2352675"/>
                     </a:xfrm>
                     <a:prstGeom prst="rect">
                       <a:avLst/>
@@ -78,6 +78,12 @@
                 </pic:pic>
               </a:graphicData>
             </a:graphic>
+            <wp14:sizeRelH relativeFrom="margin">
+              <wp14:pctWidth>0</wp14:pctWidth>
+            </wp14:sizeRelH>
+            <wp14:sizeRelV relativeFrom="margin">
+              <wp14:pctHeight>0</wp14:pctHeight>
+            </wp14:sizeRelV>
           </wp:anchor>
         </w:drawing>
       </w:r>
@@ -570,17 +576,6 @@
     <w:p>
       <w:pPr>
         <w:spacing w:after="0" w:line="240" w:lineRule="auto"/>
-        <w:jc w:val="center"/>
-        <w:rPr>
-          <w:rFonts w:ascii="Times New Roman" w:hAnsi="Times New Roman" w:cs="Times New Roman"/>
-          <w:b/>
-          <w:bCs/>
-        </w:rPr>
-      </w:pPr>
-    </w:p>
-    <w:p>
-      <w:pPr>
-        <w:spacing w:after="0" w:line="240" w:lineRule="auto"/>
         <w:rPr>
           <w:rFonts w:ascii="Times New Roman" w:hAnsi="Times New Roman" w:cs="Times New Roman"/>
           <w:b/>
@@ -654,7 +649,21 @@
         <w:rPr>
           <w:rFonts w:ascii="Times New Roman" w:hAnsi="Times New Roman" w:cs="Times New Roman"/>
         </w:rPr>
-        <w:t xml:space="preserve"> Basom (105</w:t>
+        <w:t xml:space="preserve"> </w:t>
+      </w:r>
+      <w:proofErr w:type="spellStart"/>
+      <w:r>
+        <w:rPr>
+          <w:rFonts w:ascii="Times New Roman" w:hAnsi="Times New Roman" w:cs="Times New Roman"/>
+        </w:rPr>
+        <w:t>Basom</w:t>
+      </w:r>
+      <w:proofErr w:type="spellEnd"/>
+      <w:r>
+        <w:rPr>
+          <w:rFonts w:ascii="Times New Roman" w:hAnsi="Times New Roman" w:cs="Times New Roman"/>
+        </w:rPr>
+        <w:t xml:space="preserve"> (105</w:t>
       </w:r>
       <w:r>
         <w:rPr>
@@ -689,6 +698,26 @@
           <w:rFonts w:ascii="Times New Roman" w:hAnsi="Times New Roman" w:cs="Times New Roman"/>
         </w:rPr>
         <w:t>Ezekiel Hodge (1059811)</w:t>
+      </w:r>
+    </w:p>
+    <w:p>
+      <w:pPr>
+        <w:spacing w:after="0" w:line="240" w:lineRule="auto"/>
+        <w:rPr>
+          <w:rFonts w:ascii="Times New Roman" w:hAnsi="Times New Roman" w:cs="Times New Roman"/>
+        </w:rPr>
+      </w:pPr>
+      <w:r>
+        <w:rPr>
+          <w:rFonts w:ascii="Times New Roman" w:hAnsi="Times New Roman" w:cs="Times New Roman"/>
+        </w:rPr>
+        <w:t>Shania Austin</w:t>
+      </w:r>
+      <w:r>
+        <w:rPr>
+          <w:rFonts w:ascii="Times New Roman" w:hAnsi="Times New Roman" w:cs="Times New Roman"/>
+        </w:rPr>
+        <w:t xml:space="preserve"> (1044872)</w:t>
       </w:r>
     </w:p>
     <w:p>
@@ -729,10 +758,7 @@
           <w:szCs w:val="28"/>
         </w:rPr>
       </w:pPr>
-    </w:p>
-    <w:p>
-      <w:pPr>
-        <w:spacing w:after="0" w:line="240" w:lineRule="auto"/>
+      <w:r>
         <w:rPr>
           <w:rFonts w:ascii="Times New Roman" w:hAnsi="Times New Roman" w:cs="Times New Roman"/>
           <w:b/>
@@ -741,16 +767,7 @@
           <w:sz w:val="28"/>
           <w:szCs w:val="28"/>
         </w:rPr>
-      </w:pPr>
-      <w:r>
-        <w:rPr>
-          <w:rFonts w:ascii="Times New Roman" w:hAnsi="Times New Roman" w:cs="Times New Roman"/>
-          <w:b/>
-          <w:bCs/>
-          <w:color w:val="215E99" w:themeColor="text2" w:themeTint="BF"/>
-          <w:sz w:val="28"/>
-          <w:szCs w:val="28"/>
-        </w:rPr>
+        <w:lastRenderedPageBreak/>
         <w:t>Project Overview</w:t>
       </w:r>
     </w:p>
@@ -839,21 +856,7 @@
         <w:rPr>
           <w:rFonts w:ascii="Times New Roman" w:hAnsi="Times New Roman" w:cs="Times New Roman"/>
         </w:rPr>
-        <w:t xml:space="preserve"> for </w:t>
-      </w:r>
-      <w:proofErr w:type="gramStart"/>
-      <w:r>
-        <w:rPr>
-          <w:rFonts w:ascii="Times New Roman" w:hAnsi="Times New Roman" w:cs="Times New Roman"/>
-        </w:rPr>
-        <w:t>every</w:t>
-      </w:r>
-      <w:proofErr w:type="gramEnd"/>
-      <w:r>
-        <w:rPr>
-          <w:rFonts w:ascii="Times New Roman" w:hAnsi="Times New Roman" w:cs="Times New Roman"/>
-        </w:rPr>
-        <w:t xml:space="preserve"> </w:t>
+        <w:t xml:space="preserve"> for every </w:t>
       </w:r>
       <w:r>
         <w:rPr>
@@ -966,21 +969,7 @@
         <w:rPr>
           <w:rFonts w:ascii="Times New Roman" w:hAnsi="Times New Roman" w:cs="Times New Roman"/>
         </w:rPr>
-        <w:t xml:space="preserve">Category Selection: players can either choose </w:t>
-      </w:r>
-      <w:proofErr w:type="gramStart"/>
-      <w:r>
-        <w:rPr>
-          <w:rFonts w:ascii="Times New Roman" w:hAnsi="Times New Roman" w:cs="Times New Roman"/>
-        </w:rPr>
-        <w:t>on</w:t>
-      </w:r>
-      <w:proofErr w:type="gramEnd"/>
-      <w:r>
-        <w:rPr>
-          <w:rFonts w:ascii="Times New Roman" w:hAnsi="Times New Roman" w:cs="Times New Roman"/>
-        </w:rPr>
-        <w:t xml:space="preserve"> specific category or a random mix from </w:t>
+        <w:t xml:space="preserve">Category Selection: players can either choose on specific category or a random mix from </w:t>
       </w:r>
       <w:r>
         <w:rPr>
@@ -1350,6 +1339,7 @@
           <w:sz w:val="28"/>
           <w:szCs w:val="28"/>
         </w:rPr>
+        <w:lastRenderedPageBreak/>
         <w:t>User Documentation</w:t>
       </w:r>
     </w:p>
@@ -1772,17 +1762,9 @@
         <w:rPr>
           <w:rFonts w:ascii="Times New Roman" w:hAnsi="Times New Roman" w:cs="Times New Roman"/>
         </w:rPr>
-        <w:t>scores</w:t>
-      </w:r>
-      <w:proofErr w:type="gramStart"/>
-      <w:r>
-        <w:rPr>
-          <w:rFonts w:ascii="Times New Roman" w:hAnsi="Times New Roman" w:cs="Times New Roman"/>
-        </w:rPr>
-        <w:t>.c</w:t>
+        <w:t>scores.c</w:t>
       </w:r>
       <w:proofErr w:type="spellEnd"/>
-      <w:proofErr w:type="gramEnd"/>
       <w:r>
         <w:rPr>
           <w:rFonts w:ascii="Times New Roman" w:hAnsi="Times New Roman" w:cs="Times New Roman"/>
@@ -1905,19 +1887,11 @@
         </w:rPr>
         <w:t xml:space="preserve">e </w:t>
       </w:r>
-      <w:proofErr w:type="gramStart"/>
-      <w:r>
-        <w:rPr>
-          <w:rFonts w:ascii="Times New Roman" w:hAnsi="Times New Roman" w:cs="Times New Roman"/>
-        </w:rPr>
-        <w:t>players</w:t>
-      </w:r>
-      <w:proofErr w:type="gramEnd"/>
-      <w:r>
-        <w:rPr>
-          <w:rFonts w:ascii="Times New Roman" w:hAnsi="Times New Roman" w:cs="Times New Roman"/>
-        </w:rPr>
-        <w:t xml:space="preserve"> personal score history</w:t>
+      <w:r>
+        <w:rPr>
+          <w:rFonts w:ascii="Times New Roman" w:hAnsi="Times New Roman" w:cs="Times New Roman"/>
+        </w:rPr>
+        <w:t>players personal score history</w:t>
       </w:r>
       <w:r>
         <w:rPr>
@@ -2100,6 +2074,7 @@
           <w:bCs/>
           <w:color w:val="215E99" w:themeColor="text2" w:themeTint="BF"/>
         </w:rPr>
+        <w:lastRenderedPageBreak/>
         <w:t>Playing a Game</w:t>
       </w:r>
     </w:p>
@@ -2506,21 +2481,7 @@
         <w:rPr>
           <w:rFonts w:ascii="Times New Roman" w:hAnsi="Times New Roman" w:cs="Times New Roman"/>
         </w:rPr>
-        <w:t xml:space="preserve">If wrong: you will lose one </w:t>
-      </w:r>
-      <w:proofErr w:type="gramStart"/>
-      <w:r>
-        <w:rPr>
-          <w:rFonts w:ascii="Times New Roman" w:hAnsi="Times New Roman" w:cs="Times New Roman"/>
-        </w:rPr>
-        <w:t>life</w:t>
-      </w:r>
-      <w:proofErr w:type="gramEnd"/>
-      <w:r>
-        <w:rPr>
-          <w:rFonts w:ascii="Times New Roman" w:hAnsi="Times New Roman" w:cs="Times New Roman"/>
-        </w:rPr>
-        <w:t xml:space="preserve"> and the</w:t>
+        <w:t>If wrong: you will lose one life and the</w:t>
       </w:r>
       <w:r>
         <w:rPr>
@@ -2558,21 +2519,7 @@
         <w:rPr>
           <w:rFonts w:ascii="Times New Roman" w:hAnsi="Times New Roman" w:cs="Times New Roman"/>
         </w:rPr>
-        <w:t xml:space="preserve"> question is </w:t>
-      </w:r>
-      <w:proofErr w:type="gramStart"/>
-      <w:r>
-        <w:rPr>
-          <w:rFonts w:ascii="Times New Roman" w:hAnsi="Times New Roman" w:cs="Times New Roman"/>
-        </w:rPr>
-        <w:t>a classed</w:t>
-      </w:r>
-      <w:proofErr w:type="gramEnd"/>
-      <w:r>
-        <w:rPr>
-          <w:rFonts w:ascii="Times New Roman" w:hAnsi="Times New Roman" w:cs="Times New Roman"/>
-        </w:rPr>
-        <w:t xml:space="preserve"> as a bonus question that is worth double points.</w:t>
+        <w:t xml:space="preserve"> question is a classed as a bonus question that is worth double points.</w:t>
       </w:r>
     </w:p>
     <w:p>
@@ -2738,6 +2685,7 @@
           <w:bCs/>
           <w:color w:val="215E99" w:themeColor="text2" w:themeTint="BF"/>
         </w:rPr>
+        <w:lastRenderedPageBreak/>
         <w:t>End of the Round</w:t>
       </w:r>
     </w:p>
@@ -2758,21 +2706,7 @@
         <w:rPr>
           <w:rFonts w:ascii="Times New Roman" w:hAnsi="Times New Roman" w:cs="Times New Roman"/>
         </w:rPr>
-        <w:t xml:space="preserve">your total score, questions asked and </w:t>
-      </w:r>
-      <w:proofErr w:type="gramStart"/>
-      <w:r>
-        <w:rPr>
-          <w:rFonts w:ascii="Times New Roman" w:hAnsi="Times New Roman" w:cs="Times New Roman"/>
-        </w:rPr>
-        <w:t>lives remaining</w:t>
-      </w:r>
-      <w:proofErr w:type="gramEnd"/>
-      <w:r>
-        <w:rPr>
-          <w:rFonts w:ascii="Times New Roman" w:hAnsi="Times New Roman" w:cs="Times New Roman"/>
-        </w:rPr>
-        <w:t xml:space="preserve"> will be displayed. Your score is automatically saved to </w:t>
+        <w:t xml:space="preserve">your total score, questions asked and lives remaining will be displayed. Your score is automatically saved to </w:t>
       </w:r>
       <w:r>
         <w:rPr>
@@ -2889,21 +2823,7 @@
         <w:rPr>
           <w:rFonts w:ascii="Times New Roman" w:hAnsi="Times New Roman" w:cs="Times New Roman"/>
         </w:rPr>
-        <w:t xml:space="preserve"> across all the players. The leaderboard is saved between every </w:t>
-      </w:r>
-      <w:proofErr w:type="gramStart"/>
-      <w:r>
-        <w:rPr>
-          <w:rFonts w:ascii="Times New Roman" w:hAnsi="Times New Roman" w:cs="Times New Roman"/>
-        </w:rPr>
-        <w:t>session</w:t>
-      </w:r>
-      <w:proofErr w:type="gramEnd"/>
-      <w:r>
-        <w:rPr>
-          <w:rFonts w:ascii="Times New Roman" w:hAnsi="Times New Roman" w:cs="Times New Roman"/>
-        </w:rPr>
-        <w:t xml:space="preserve"> </w:t>
+        <w:t xml:space="preserve"> across all the players. The leaderboard is saved between every session </w:t>
       </w:r>
       <w:r>
         <w:rPr>
@@ -3245,6 +3165,7 @@
           <w:bCs/>
           <w:color w:val="215E99" w:themeColor="text2" w:themeTint="BF"/>
         </w:rPr>
+        <w:lastRenderedPageBreak/>
         <w:t>Quitting the Game</w:t>
       </w:r>
     </w:p>
@@ -3674,6 +3595,7 @@
           <w:sz w:val="28"/>
           <w:szCs w:val="28"/>
         </w:rPr>
+        <w:lastRenderedPageBreak/>
         <w:t>Technica</w:t>
       </w:r>
       <w:r>
@@ -4323,23 +4245,13 @@
           <w:bCs/>
         </w:rPr>
       </w:pPr>
-      <w:proofErr w:type="gramStart"/>
-      <w:r>
-        <w:rPr>
-          <w:rFonts w:ascii="Times New Roman" w:hAnsi="Times New Roman" w:cs="Times New Roman"/>
-          <w:b/>
-          <w:bCs/>
-        </w:rPr>
-        <w:t>Include</w:t>
-      </w:r>
-      <w:proofErr w:type="gramEnd"/>
-      <w:r>
-        <w:rPr>
-          <w:rFonts w:ascii="Times New Roman" w:hAnsi="Times New Roman" w:cs="Times New Roman"/>
-          <w:b/>
-          <w:bCs/>
-        </w:rPr>
-        <w:t xml:space="preserve"> Guard</w:t>
+      <w:r>
+        <w:rPr>
+          <w:rFonts w:ascii="Times New Roman" w:hAnsi="Times New Roman" w:cs="Times New Roman"/>
+          <w:b/>
+          <w:bCs/>
+        </w:rPr>
+        <w:t>Include Guard</w:t>
       </w:r>
     </w:p>
     <w:p>
@@ -4485,21 +4397,7 @@
         <w:rPr>
           <w:rFonts w:ascii="Times New Roman" w:hAnsi="Times New Roman" w:cs="Times New Roman"/>
         </w:rPr>
-        <w:t xml:space="preserve"> the compiler </w:t>
-      </w:r>
-      <w:proofErr w:type="gramStart"/>
-      <w:r>
-        <w:rPr>
-          <w:rFonts w:ascii="Times New Roman" w:hAnsi="Times New Roman" w:cs="Times New Roman"/>
-        </w:rPr>
-        <w:t>would</w:t>
-      </w:r>
-      <w:proofErr w:type="gramEnd"/>
-      <w:r>
-        <w:rPr>
-          <w:rFonts w:ascii="Times New Roman" w:hAnsi="Times New Roman" w:cs="Times New Roman"/>
-        </w:rPr>
-        <w:t xml:space="preserve"> see the struct definitions once and not throw an error since it </w:t>
+        <w:t xml:space="preserve"> the compiler would see the struct definitions once and not throw an error since it </w:t>
       </w:r>
       <w:proofErr w:type="spellStart"/>
       <w:r>
@@ -4530,7 +4428,6 @@
         <w:t xml:space="preserve"> and </w:t>
       </w:r>
       <w:proofErr w:type="spellStart"/>
-      <w:proofErr w:type="gramStart"/>
       <w:r>
         <w:rPr>
           <w:rFonts w:ascii="Times New Roman" w:hAnsi="Times New Roman" w:cs="Times New Roman"/>
@@ -4538,7 +4435,6 @@
         <w:t>questions.c</w:t>
       </w:r>
       <w:proofErr w:type="spellEnd"/>
-      <w:proofErr w:type="gramEnd"/>
       <w:r>
         <w:rPr>
           <w:rFonts w:ascii="Times New Roman" w:hAnsi="Times New Roman" w:cs="Times New Roman"/>
@@ -5505,21 +5401,7 @@
               <w:rPr>
                 <w:rFonts w:ascii="Times New Roman" w:hAnsi="Times New Roman" w:cs="Times New Roman"/>
               </w:rPr>
-              <w:t xml:space="preserve">Show how </w:t>
-            </w:r>
-            <w:proofErr w:type="gramStart"/>
-            <w:r>
-              <w:rPr>
-                <w:rFonts w:ascii="Times New Roman" w:hAnsi="Times New Roman" w:cs="Times New Roman"/>
-              </w:rPr>
-              <w:t>much</w:t>
-            </w:r>
-            <w:proofErr w:type="gramEnd"/>
-            <w:r>
-              <w:rPr>
-                <w:rFonts w:ascii="Times New Roman" w:hAnsi="Times New Roman" w:cs="Times New Roman"/>
-              </w:rPr>
-              <w:t xml:space="preserve"> questions have</w:t>
+              <w:t>Show how much questions have</w:t>
             </w:r>
             <w:r>
               <w:rPr>
@@ -5848,19 +5730,11 @@
         </w:rPr>
       </w:pPr>
       <w:proofErr w:type="spellStart"/>
-      <w:proofErr w:type="gramStart"/>
-      <w:r>
-        <w:rPr>
-          <w:rFonts w:ascii="Times New Roman" w:hAnsi="Times New Roman" w:cs="Times New Roman"/>
-        </w:rPr>
-        <w:t>main</w:t>
-      </w:r>
-      <w:proofErr w:type="gramEnd"/>
-      <w:r>
-        <w:rPr>
-          <w:rFonts w:ascii="Times New Roman" w:hAnsi="Times New Roman" w:cs="Times New Roman"/>
-        </w:rPr>
-        <w:t>.c</w:t>
+      <w:r>
+        <w:rPr>
+          <w:rFonts w:ascii="Times New Roman" w:hAnsi="Times New Roman" w:cs="Times New Roman"/>
+        </w:rPr>
+        <w:t>main.c</w:t>
       </w:r>
       <w:proofErr w:type="spellEnd"/>
       <w:r>
@@ -5893,21 +5767,7 @@
         <w:rPr>
           <w:rFonts w:ascii="Times New Roman" w:hAnsi="Times New Roman" w:cs="Times New Roman"/>
         </w:rPr>
-        <w:t xml:space="preserve"> </w:t>
-      </w:r>
-      <w:proofErr w:type="gramStart"/>
-      <w:r>
-        <w:rPr>
-          <w:rFonts w:ascii="Times New Roman" w:hAnsi="Times New Roman" w:cs="Times New Roman"/>
-        </w:rPr>
-        <w:t>just is</w:t>
-      </w:r>
-      <w:proofErr w:type="gramEnd"/>
-      <w:r>
-        <w:rPr>
-          <w:rFonts w:ascii="Times New Roman" w:hAnsi="Times New Roman" w:cs="Times New Roman"/>
-        </w:rPr>
-        <w:t xml:space="preserve"> to start the program, collect player names and keep the menu running. </w:t>
+        <w:t xml:space="preserve"> just is to start the program, collect player names and keep the menu running. </w:t>
       </w:r>
       <w:r>
         <w:rPr>
@@ -6191,21 +6051,7 @@
         <w:rPr>
           <w:rFonts w:ascii="Times New Roman" w:hAnsi="Times New Roman" w:cs="Times New Roman"/>
         </w:rPr>
-        <w:t xml:space="preserve">uffer, if this is not cleared then the input read </w:t>
-      </w:r>
-      <w:proofErr w:type="gramStart"/>
-      <w:r>
-        <w:rPr>
-          <w:rFonts w:ascii="Times New Roman" w:hAnsi="Times New Roman" w:cs="Times New Roman"/>
-        </w:rPr>
-        <w:t>would</w:t>
-      </w:r>
-      <w:proofErr w:type="gramEnd"/>
-      <w:r>
-        <w:rPr>
-          <w:rFonts w:ascii="Times New Roman" w:hAnsi="Times New Roman" w:cs="Times New Roman"/>
-        </w:rPr>
-        <w:t xml:space="preserve"> pick it up and will skip waiting for the pla</w:t>
+        <w:t>uffer, if this is not cleared then the input read would pick it up and will skip waiting for the pla</w:t>
       </w:r>
       <w:r>
         <w:rPr>
@@ -6406,7 +6252,6 @@
         <w:t xml:space="preserve">) instead of </w:t>
       </w:r>
       <w:proofErr w:type="spellStart"/>
-      <w:proofErr w:type="gramStart"/>
       <w:r>
         <w:rPr>
           <w:rFonts w:ascii="Times New Roman" w:hAnsi="Times New Roman" w:cs="Times New Roman"/>
@@ -6418,34 +6263,13 @@
         <w:rPr>
           <w:rFonts w:ascii="Times New Roman" w:hAnsi="Times New Roman" w:cs="Times New Roman"/>
         </w:rPr>
-        <w:t>(</w:t>
-      </w:r>
-      <w:proofErr w:type="gramEnd"/>
-      <w:r>
-        <w:rPr>
-          <w:rFonts w:ascii="Times New Roman" w:hAnsi="Times New Roman" w:cs="Times New Roman"/>
-        </w:rPr>
-        <w:t>) for the name because it read the entire line of input which includes the spaces</w:t>
-      </w:r>
-      <w:r>
-        <w:rPr>
-          <w:rFonts w:ascii="Times New Roman" w:hAnsi="Times New Roman" w:cs="Times New Roman"/>
-        </w:rPr>
-        <w:t xml:space="preserve">. </w:t>
-      </w:r>
-      <w:proofErr w:type="gramStart"/>
-      <w:r>
-        <w:rPr>
-          <w:rFonts w:ascii="Times New Roman" w:hAnsi="Times New Roman" w:cs="Times New Roman"/>
-        </w:rPr>
-        <w:t>Whereas,</w:t>
-      </w:r>
-      <w:proofErr w:type="gramEnd"/>
-      <w:r>
-        <w:rPr>
-          <w:rFonts w:ascii="Times New Roman" w:hAnsi="Times New Roman" w:cs="Times New Roman"/>
-        </w:rPr>
-        <w:t xml:space="preserve"> </w:t>
+        <w:t>() for the name because it read the entire line of input which includes the spaces</w:t>
+      </w:r>
+      <w:r>
+        <w:rPr>
+          <w:rFonts w:ascii="Times New Roman" w:hAnsi="Times New Roman" w:cs="Times New Roman"/>
+        </w:rPr>
+        <w:t xml:space="preserve">. Whereas, </w:t>
       </w:r>
       <w:proofErr w:type="spellStart"/>
       <w:proofErr w:type="gramStart"/>
@@ -6473,35 +6297,7 @@
         <w:rPr>
           <w:rFonts w:ascii="Times New Roman" w:hAnsi="Times New Roman" w:cs="Times New Roman"/>
         </w:rPr>
-        <w:t xml:space="preserve">would stop at the space so if you were </w:t>
-      </w:r>
-      <w:proofErr w:type="gramStart"/>
-      <w:r>
-        <w:rPr>
-          <w:rFonts w:ascii="Times New Roman" w:hAnsi="Times New Roman" w:cs="Times New Roman"/>
-        </w:rPr>
-        <w:t>type</w:t>
-      </w:r>
-      <w:proofErr w:type="gramEnd"/>
-      <w:r>
-        <w:rPr>
-          <w:rFonts w:ascii="Times New Roman" w:hAnsi="Times New Roman" w:cs="Times New Roman"/>
-        </w:rPr>
-        <w:t xml:space="preserve"> your full </w:t>
-      </w:r>
-      <w:proofErr w:type="gramStart"/>
-      <w:r>
-        <w:rPr>
-          <w:rFonts w:ascii="Times New Roman" w:hAnsi="Times New Roman" w:cs="Times New Roman"/>
-        </w:rPr>
-        <w:t>name</w:t>
-      </w:r>
-      <w:proofErr w:type="gramEnd"/>
-      <w:r>
-        <w:rPr>
-          <w:rFonts w:ascii="Times New Roman" w:hAnsi="Times New Roman" w:cs="Times New Roman"/>
-        </w:rPr>
-        <w:t xml:space="preserve"> it would only read the first.</w:t>
+        <w:t>would stop at the space so if you were type your full name it would only read the first.</w:t>
       </w:r>
     </w:p>
     <w:p>
@@ -6768,7 +6564,6 @@
         <w:t xml:space="preserve"> will get </w:t>
       </w:r>
       <w:proofErr w:type="spellStart"/>
-      <w:proofErr w:type="gramStart"/>
       <w:r>
         <w:rPr>
           <w:rFonts w:ascii="Times New Roman" w:hAnsi="Times New Roman" w:cs="Times New Roman"/>
@@ -6776,7 +6571,6 @@
         <w:t>a</w:t>
       </w:r>
       <w:proofErr w:type="spellEnd"/>
-      <w:proofErr w:type="gramEnd"/>
       <w:r>
         <w:rPr>
           <w:rFonts w:ascii="Times New Roman" w:hAnsi="Times New Roman" w:cs="Times New Roman"/>
@@ -6930,21 +6724,7 @@
         <w:rPr>
           <w:rFonts w:ascii="Times New Roman" w:hAnsi="Times New Roman" w:cs="Times New Roman"/>
         </w:rPr>
-        <w:t xml:space="preserve">In this section same check is done for if something weird is entered, game defaults </w:t>
-      </w:r>
-      <w:proofErr w:type="gramStart"/>
-      <w:r>
-        <w:rPr>
-          <w:rFonts w:ascii="Times New Roman" w:hAnsi="Times New Roman" w:cs="Times New Roman"/>
-        </w:rPr>
-        <w:t>to</w:t>
-      </w:r>
-      <w:proofErr w:type="gramEnd"/>
-      <w:r>
-        <w:rPr>
-          <w:rFonts w:ascii="Times New Roman" w:hAnsi="Times New Roman" w:cs="Times New Roman"/>
-        </w:rPr>
-        <w:t xml:space="preserve"> </w:t>
+        <w:t xml:space="preserve">In this section same check is done for if something weird is entered, game defaults to </w:t>
       </w:r>
       <w:r>
         <w:rPr>
@@ -7228,7 +7008,6 @@
               <w:t xml:space="preserve">) then </w:t>
             </w:r>
             <w:proofErr w:type="spellStart"/>
-            <w:proofErr w:type="gramStart"/>
             <w:r>
               <w:rPr>
                 <w:rFonts w:ascii="Times New Roman" w:eastAsia="Arial" w:hAnsi="Times New Roman" w:cs="Times New Roman"/>
@@ -7240,48 +7019,33 @@
               <w:rPr>
                 <w:rFonts w:ascii="Times New Roman" w:eastAsia="Arial" w:hAnsi="Times New Roman" w:cs="Times New Roman"/>
               </w:rPr>
-              <w:t>(</w:t>
-            </w:r>
-            <w:proofErr w:type="gramEnd"/>
+              <w:t xml:space="preserve">() </w:t>
+            </w:r>
             <w:r>
               <w:rPr>
                 <w:rFonts w:ascii="Times New Roman" w:eastAsia="Arial" w:hAnsi="Times New Roman" w:cs="Times New Roman"/>
               </w:rPr>
-              <w:t xml:space="preserve">) </w:t>
+              <w:t xml:space="preserve">and </w:t>
             </w:r>
             <w:r>
               <w:rPr>
                 <w:rFonts w:ascii="Times New Roman" w:eastAsia="Arial" w:hAnsi="Times New Roman" w:cs="Times New Roman"/>
               </w:rPr>
-              <w:t xml:space="preserve">and </w:t>
-            </w:r>
+              <w:t xml:space="preserve">then </w:t>
+            </w:r>
+            <w:proofErr w:type="spellStart"/>
             <w:r>
               <w:rPr>
                 <w:rFonts w:ascii="Times New Roman" w:eastAsia="Arial" w:hAnsi="Times New Roman" w:cs="Times New Roman"/>
               </w:rPr>
-              <w:t xml:space="preserve">then </w:t>
-            </w:r>
-            <w:proofErr w:type="spellStart"/>
-            <w:proofErr w:type="gramStart"/>
+              <w:t>playRound</w:t>
+            </w:r>
+            <w:proofErr w:type="spellEnd"/>
             <w:r>
               <w:rPr>
                 <w:rFonts w:ascii="Times New Roman" w:eastAsia="Arial" w:hAnsi="Times New Roman" w:cs="Times New Roman"/>
               </w:rPr>
-              <w:t>playRound</w:t>
-            </w:r>
-            <w:proofErr w:type="spellEnd"/>
-            <w:r>
-              <w:rPr>
-                <w:rFonts w:ascii="Times New Roman" w:eastAsia="Arial" w:hAnsi="Times New Roman" w:cs="Times New Roman"/>
-              </w:rPr>
-              <w:t>(</w:t>
-            </w:r>
-            <w:proofErr w:type="gramEnd"/>
-            <w:r>
-              <w:rPr>
-                <w:rFonts w:ascii="Times New Roman" w:eastAsia="Arial" w:hAnsi="Times New Roman" w:cs="Times New Roman"/>
-              </w:rPr>
-              <w:t>) with the results.</w:t>
+              <w:t>() with the results.</w:t>
             </w:r>
           </w:p>
         </w:tc>
@@ -7815,7 +7579,6 @@
         <w:t xml:space="preserve">) and running the game round in </w:t>
       </w:r>
       <w:proofErr w:type="spellStart"/>
-      <w:proofErr w:type="gramStart"/>
       <w:r>
         <w:rPr>
           <w:rFonts w:ascii="Times New Roman" w:hAnsi="Times New Roman" w:cs="Times New Roman"/>
@@ -7827,14 +7590,7 @@
         <w:rPr>
           <w:rFonts w:ascii="Times New Roman" w:hAnsi="Times New Roman" w:cs="Times New Roman"/>
         </w:rPr>
-        <w:t>(</w:t>
-      </w:r>
-      <w:proofErr w:type="gramEnd"/>
-      <w:r>
-        <w:rPr>
-          <w:rFonts w:ascii="Times New Roman" w:hAnsi="Times New Roman" w:cs="Times New Roman"/>
-        </w:rPr>
-        <w:t>)</w:t>
+        <w:t>()</w:t>
       </w:r>
       <w:r>
         <w:rPr>
@@ -7910,49 +7666,7 @@
         <w:rPr>
           <w:rFonts w:ascii="Times New Roman" w:hAnsi="Times New Roman" w:cs="Times New Roman"/>
         </w:rPr>
-        <w:t xml:space="preserve">This function initializes when the game starts and loads </w:t>
-      </w:r>
-      <w:proofErr w:type="gramStart"/>
-      <w:r>
-        <w:rPr>
-          <w:rFonts w:ascii="Times New Roman" w:hAnsi="Times New Roman" w:cs="Times New Roman"/>
-        </w:rPr>
-        <w:t>all of</w:t>
-      </w:r>
-      <w:proofErr w:type="gramEnd"/>
-      <w:r>
-        <w:rPr>
-          <w:rFonts w:ascii="Times New Roman" w:hAnsi="Times New Roman" w:cs="Times New Roman"/>
-        </w:rPr>
-        <w:t xml:space="preserve"> the </w:t>
-      </w:r>
-      <w:proofErr w:type="gramStart"/>
-      <w:r>
-        <w:rPr>
-          <w:rFonts w:ascii="Times New Roman" w:hAnsi="Times New Roman" w:cs="Times New Roman"/>
-        </w:rPr>
-        <w:t>question</w:t>
-      </w:r>
-      <w:proofErr w:type="gramEnd"/>
-      <w:r>
-        <w:rPr>
-          <w:rFonts w:ascii="Times New Roman" w:hAnsi="Times New Roman" w:cs="Times New Roman"/>
-        </w:rPr>
-        <w:t xml:space="preserve"> into the category array. Each question is then added one by one by writing its text, options and correct </w:t>
-      </w:r>
-      <w:proofErr w:type="gramStart"/>
-      <w:r>
-        <w:rPr>
-          <w:rFonts w:ascii="Times New Roman" w:hAnsi="Times New Roman" w:cs="Times New Roman"/>
-        </w:rPr>
-        <w:t>answer</w:t>
-      </w:r>
-      <w:proofErr w:type="gramEnd"/>
-      <w:r>
-        <w:rPr>
-          <w:rFonts w:ascii="Times New Roman" w:hAnsi="Times New Roman" w:cs="Times New Roman"/>
-        </w:rPr>
-        <w:t xml:space="preserve"> into the next open slot and then increasing the question count for the category.</w:t>
+        <w:t>This function initializes when the game starts and loads all of the question into the category array. Each question is then added one by one by writing its text, options and correct answer into the next open slot and then increasing the question count for the category.</w:t>
       </w:r>
     </w:p>
     <w:p>
@@ -8107,21 +7821,7 @@
         <w:rPr>
           <w:rFonts w:ascii="Times New Roman" w:hAnsi="Times New Roman" w:cs="Times New Roman"/>
         </w:rPr>
-        <w:t xml:space="preserve"> file can know how many there </w:t>
-      </w:r>
-      <w:proofErr w:type="gramStart"/>
-      <w:r>
-        <w:rPr>
-          <w:rFonts w:ascii="Times New Roman" w:hAnsi="Times New Roman" w:cs="Times New Roman"/>
-        </w:rPr>
-        <w:t>is</w:t>
-      </w:r>
-      <w:proofErr w:type="gramEnd"/>
-      <w:r>
-        <w:rPr>
-          <w:rFonts w:ascii="Times New Roman" w:hAnsi="Times New Roman" w:cs="Times New Roman"/>
-        </w:rPr>
-        <w:t>.</w:t>
+        <w:t xml:space="preserve"> file can know how many there is.</w:t>
       </w:r>
     </w:p>
     <w:p>
@@ -8224,7 +7924,6 @@
         <w:t xml:space="preserve">) and </w:t>
       </w:r>
       <w:proofErr w:type="spellStart"/>
-      <w:proofErr w:type="gramStart"/>
       <w:r>
         <w:rPr>
           <w:rFonts w:ascii="Times New Roman" w:hAnsi="Times New Roman" w:cs="Times New Roman"/>
@@ -8236,28 +7935,7 @@
         <w:rPr>
           <w:rFonts w:ascii="Times New Roman" w:hAnsi="Times New Roman" w:cs="Times New Roman"/>
         </w:rPr>
-        <w:t>(</w:t>
-      </w:r>
-      <w:proofErr w:type="gramEnd"/>
-      <w:r>
-        <w:rPr>
-          <w:rFonts w:ascii="Times New Roman" w:hAnsi="Times New Roman" w:cs="Times New Roman"/>
-        </w:rPr>
-        <w:t xml:space="preserve">) so the display code only </w:t>
-      </w:r>
-      <w:proofErr w:type="gramStart"/>
-      <w:r>
-        <w:rPr>
-          <w:rFonts w:ascii="Times New Roman" w:hAnsi="Times New Roman" w:cs="Times New Roman"/>
-        </w:rPr>
-        <w:t>has to</w:t>
-      </w:r>
-      <w:proofErr w:type="gramEnd"/>
-      <w:r>
-        <w:rPr>
-          <w:rFonts w:ascii="Times New Roman" w:hAnsi="Times New Roman" w:cs="Times New Roman"/>
-        </w:rPr>
-        <w:t xml:space="preserve"> be written once.</w:t>
+        <w:t>() so the display code only has to be written once.</w:t>
       </w:r>
     </w:p>
     <w:p>
@@ -9098,7 +8776,6 @@
         <w:t xml:space="preserve">return the current time as a number, </w:t>
       </w:r>
       <w:proofErr w:type="spellStart"/>
-      <w:proofErr w:type="gramStart"/>
       <w:r>
         <w:rPr>
           <w:rFonts w:ascii="Times New Roman" w:hAnsi="Times New Roman" w:cs="Times New Roman"/>
@@ -9116,14 +8793,7 @@
         <w:rPr>
           <w:rFonts w:ascii="Times New Roman" w:hAnsi="Times New Roman" w:cs="Times New Roman"/>
         </w:rPr>
-        <w:t>(</w:t>
-      </w:r>
-      <w:proofErr w:type="gramEnd"/>
-      <w:r>
-        <w:rPr>
-          <w:rFonts w:ascii="Times New Roman" w:hAnsi="Times New Roman" w:cs="Times New Roman"/>
-        </w:rPr>
-        <w:t>) t</w:t>
+        <w:t>() t</w:t>
       </w:r>
       <w:r>
         <w:rPr>
@@ -9138,7 +8808,6 @@
         <w:t xml:space="preserve">shuffle will output a different order </w:t>
       </w:r>
       <w:proofErr w:type="spellStart"/>
-      <w:proofErr w:type="gramStart"/>
       <w:r>
         <w:rPr>
           <w:rFonts w:ascii="Times New Roman" w:hAnsi="Times New Roman" w:cs="Times New Roman"/>
@@ -9146,7 +8815,6 @@
         <w:t>everytime</w:t>
       </w:r>
       <w:proofErr w:type="spellEnd"/>
-      <w:proofErr w:type="gramEnd"/>
       <w:r>
         <w:rPr>
           <w:rFonts w:ascii="Times New Roman" w:hAnsi="Times New Roman" w:cs="Times New Roman"/>
@@ -9246,21 +8914,7 @@
         <w:rPr>
           <w:rFonts w:ascii="Times New Roman" w:hAnsi="Times New Roman" w:cs="Times New Roman"/>
         </w:rPr>
-        <w:t xml:space="preserve">Pointers (memory address) are stored in the pool to the questions </w:t>
-      </w:r>
-      <w:proofErr w:type="gramStart"/>
-      <w:r>
-        <w:rPr>
-          <w:rFonts w:ascii="Times New Roman" w:hAnsi="Times New Roman" w:cs="Times New Roman"/>
-        </w:rPr>
-        <w:t>rather</w:t>
-      </w:r>
-      <w:proofErr w:type="gramEnd"/>
-      <w:r>
-        <w:rPr>
-          <w:rFonts w:ascii="Times New Roman" w:hAnsi="Times New Roman" w:cs="Times New Roman"/>
-        </w:rPr>
-        <w:t xml:space="preserve"> copying the ques</w:t>
+        <w:t>Pointers (memory address) are stored in the pool to the questions rather copying the ques</w:t>
       </w:r>
       <w:r>
         <w:rPr>
@@ -10359,49 +10013,13 @@
         <w:rPr>
           <w:rFonts w:ascii="Times New Roman" w:hAnsi="Times New Roman" w:cs="Times New Roman"/>
         </w:rPr>
-        <w:t xml:space="preserve">The </w:t>
-      </w:r>
-      <w:proofErr w:type="gramStart"/>
-      <w:r>
-        <w:rPr>
-          <w:rFonts w:ascii="Times New Roman" w:hAnsi="Times New Roman" w:cs="Times New Roman"/>
-        </w:rPr>
-        <w:t>codes</w:t>
-      </w:r>
-      <w:proofErr w:type="gramEnd"/>
-      <w:r>
-        <w:rPr>
-          <w:rFonts w:ascii="Times New Roman" w:hAnsi="Times New Roman" w:cs="Times New Roman"/>
-        </w:rPr>
-        <w:t xml:space="preserve"> in this file </w:t>
-      </w:r>
-      <w:proofErr w:type="gramStart"/>
-      <w:r>
-        <w:rPr>
-          <w:rFonts w:ascii="Times New Roman" w:hAnsi="Times New Roman" w:cs="Times New Roman"/>
-        </w:rPr>
-        <w:t>holds</w:t>
-      </w:r>
-      <w:proofErr w:type="gramEnd"/>
-      <w:r>
-        <w:rPr>
-          <w:rFonts w:ascii="Times New Roman" w:hAnsi="Times New Roman" w:cs="Times New Roman"/>
-        </w:rPr>
-        <w:t xml:space="preserve"> the </w:t>
-      </w:r>
-      <w:proofErr w:type="gramStart"/>
-      <w:r>
-        <w:rPr>
-          <w:rFonts w:ascii="Times New Roman" w:hAnsi="Times New Roman" w:cs="Times New Roman"/>
-        </w:rPr>
-        <w:t>players</w:t>
-      </w:r>
-      <w:proofErr w:type="gramEnd"/>
-      <w:r>
-        <w:rPr>
-          <w:rFonts w:ascii="Times New Roman" w:hAnsi="Times New Roman" w:cs="Times New Roman"/>
-        </w:rPr>
-        <w:t xml:space="preserve"> name, score value and name the </w:t>
+        <w:t xml:space="preserve">The codes in this file </w:t>
+      </w:r>
+      <w:r>
+        <w:rPr>
+          <w:rFonts w:ascii="Times New Roman" w:hAnsi="Times New Roman" w:cs="Times New Roman"/>
+        </w:rPr>
+        <w:t xml:space="preserve">holds the players name, score value and name the </w:t>
       </w:r>
       <w:proofErr w:type="spellStart"/>
       <w:r>
@@ -11276,7 +10894,6 @@
         <w:t xml:space="preserve">) and </w:t>
       </w:r>
       <w:proofErr w:type="spellStart"/>
-      <w:proofErr w:type="gramStart"/>
       <w:r>
         <w:rPr>
           <w:rFonts w:ascii="Times New Roman" w:hAnsi="Times New Roman" w:cs="Times New Roman"/>
@@ -11288,28 +10905,7 @@
         <w:rPr>
           <w:rFonts w:ascii="Times New Roman" w:hAnsi="Times New Roman" w:cs="Times New Roman"/>
         </w:rPr>
-        <w:t>(</w:t>
-      </w:r>
-      <w:proofErr w:type="gramEnd"/>
-      <w:r>
-        <w:rPr>
-          <w:rFonts w:ascii="Times New Roman" w:hAnsi="Times New Roman" w:cs="Times New Roman"/>
-        </w:rPr>
-        <w:t xml:space="preserve">) check </w:t>
-      </w:r>
-      <w:proofErr w:type="gramStart"/>
-      <w:r>
-        <w:rPr>
-          <w:rFonts w:ascii="Times New Roman" w:hAnsi="Times New Roman" w:cs="Times New Roman"/>
-        </w:rPr>
-        <w:t>if  (</w:t>
-      </w:r>
-      <w:proofErr w:type="gramEnd"/>
-      <w:r>
-        <w:rPr>
-          <w:rFonts w:ascii="Times New Roman" w:hAnsi="Times New Roman" w:cs="Times New Roman"/>
-        </w:rPr>
-        <w:t>!f) return</w:t>
+        <w:t>() check if  (!f) return</w:t>
       </w:r>
       <w:r>
         <w:rPr>
@@ -11318,7 +10914,6 @@
         <w:t xml:space="preserve"> after </w:t>
       </w:r>
       <w:proofErr w:type="spellStart"/>
-      <w:proofErr w:type="gramStart"/>
       <w:r>
         <w:rPr>
           <w:rFonts w:ascii="Times New Roman" w:hAnsi="Times New Roman" w:cs="Times New Roman"/>
@@ -11330,28 +10925,7 @@
         <w:rPr>
           <w:rFonts w:ascii="Times New Roman" w:hAnsi="Times New Roman" w:cs="Times New Roman"/>
         </w:rPr>
-        <w:t>(</w:t>
-      </w:r>
-      <w:proofErr w:type="gramEnd"/>
-      <w:r>
-        <w:rPr>
-          <w:rFonts w:ascii="Times New Roman" w:hAnsi="Times New Roman" w:cs="Times New Roman"/>
-        </w:rPr>
-        <w:t xml:space="preserve">). If scores.txt cannot be opened or does not </w:t>
-      </w:r>
-      <w:proofErr w:type="gramStart"/>
-      <w:r>
-        <w:rPr>
-          <w:rFonts w:ascii="Times New Roman" w:hAnsi="Times New Roman" w:cs="Times New Roman"/>
-        </w:rPr>
-        <w:t>exist</w:t>
-      </w:r>
-      <w:proofErr w:type="gramEnd"/>
-      <w:r>
-        <w:rPr>
-          <w:rFonts w:ascii="Times New Roman" w:hAnsi="Times New Roman" w:cs="Times New Roman"/>
-        </w:rPr>
-        <w:t xml:space="preserve"> </w:t>
+        <w:t xml:space="preserve">(). If scores.txt cannot be opened or does not exist </w:t>
       </w:r>
       <w:r>
         <w:rPr>
@@ -11543,9 +11117,14 @@
         <w:rPr>
           <w:rFonts w:ascii="Times New Roman" w:hAnsi="Times New Roman" w:cs="Times New Roman"/>
         </w:rPr>
-        <w:t xml:space="preserve">We </w:t>
-      </w:r>
-      <w:proofErr w:type="gramStart"/>
+        <w:t>We %49[^\n]</w:t>
+      </w:r>
+      <w:r>
+        <w:rPr>
+          <w:rFonts w:ascii="Times New Roman" w:hAnsi="Times New Roman" w:cs="Times New Roman"/>
+        </w:rPr>
+        <w:t xml:space="preserve"> used instead of %49 because %S stops reading at a space, whereas, </w:t>
+      </w:r>
       <w:r>
         <w:rPr>
           <w:rFonts w:ascii="Times New Roman" w:hAnsi="Times New Roman" w:cs="Times New Roman"/>
@@ -11556,74 +11135,13 @@
         <w:rPr>
           <w:rFonts w:ascii="Times New Roman" w:hAnsi="Times New Roman" w:cs="Times New Roman"/>
         </w:rPr>
-        <w:t xml:space="preserve"> used</w:t>
-      </w:r>
-      <w:proofErr w:type="gramEnd"/>
-      <w:r>
-        <w:rPr>
-          <w:rFonts w:ascii="Times New Roman" w:hAnsi="Times New Roman" w:cs="Times New Roman"/>
-        </w:rPr>
-        <w:t xml:space="preserve"> instead of %49 because %S stops reading at a space, </w:t>
-      </w:r>
-      <w:proofErr w:type="gramStart"/>
-      <w:r>
-        <w:rPr>
-          <w:rFonts w:ascii="Times New Roman" w:hAnsi="Times New Roman" w:cs="Times New Roman"/>
-        </w:rPr>
-        <w:t>whereas,</w:t>
-      </w:r>
-      <w:proofErr w:type="gramEnd"/>
-      <w:r>
-        <w:rPr>
-          <w:rFonts w:ascii="Times New Roman" w:hAnsi="Times New Roman" w:cs="Times New Roman"/>
-        </w:rPr>
-        <w:t xml:space="preserve"> </w:t>
-      </w:r>
-      <w:r>
-        <w:rPr>
-          <w:rFonts w:ascii="Times New Roman" w:hAnsi="Times New Roman" w:cs="Times New Roman"/>
-        </w:rPr>
-        <w:t>%49[^\n]</w:t>
-      </w:r>
-      <w:r>
-        <w:rPr>
-          <w:rFonts w:ascii="Times New Roman" w:hAnsi="Times New Roman" w:cs="Times New Roman"/>
-        </w:rPr>
-        <w:t xml:space="preserve"> reads everything up to the newline </w:t>
-      </w:r>
-      <w:proofErr w:type="gramStart"/>
-      <w:r>
-        <w:rPr>
-          <w:rFonts w:ascii="Times New Roman" w:hAnsi="Times New Roman" w:cs="Times New Roman"/>
-        </w:rPr>
-        <w:t>character</w:t>
-      </w:r>
-      <w:proofErr w:type="gramEnd"/>
-      <w:r>
-        <w:rPr>
-          <w:rFonts w:ascii="Times New Roman" w:hAnsi="Times New Roman" w:cs="Times New Roman"/>
-        </w:rPr>
-        <w:t xml:space="preserve"> so this was the full name is captured.</w:t>
-      </w:r>
-      <w:r>
-        <w:rPr>
-          <w:rFonts w:ascii="Times New Roman" w:hAnsi="Times New Roman" w:cs="Times New Roman"/>
-        </w:rPr>
-        <w:t xml:space="preserve"> This first line of code reads each line from the txt </w:t>
-      </w:r>
-      <w:proofErr w:type="gramStart"/>
-      <w:r>
-        <w:rPr>
-          <w:rFonts w:ascii="Times New Roman" w:hAnsi="Times New Roman" w:cs="Times New Roman"/>
-        </w:rPr>
-        <w:t>file,</w:t>
-      </w:r>
-      <w:proofErr w:type="gramEnd"/>
-      <w:r>
-        <w:rPr>
-          <w:rFonts w:ascii="Times New Roman" w:hAnsi="Times New Roman" w:cs="Times New Roman"/>
-        </w:rPr>
-        <w:t xml:space="preserve"> second line checks </w:t>
+        <w:t xml:space="preserve"> reads everything up to the newline character so this was the full name is captured.</w:t>
+      </w:r>
+      <w:r>
+        <w:rPr>
+          <w:rFonts w:ascii="Times New Roman" w:hAnsi="Times New Roman" w:cs="Times New Roman"/>
+        </w:rPr>
+        <w:t xml:space="preserve"> This first line of code reads each line from the txt file, second line checks </w:t>
       </w:r>
       <w:r>
         <w:rPr>
@@ -12454,21 +11972,7 @@
               <w:rPr>
                 <w:rFonts w:ascii="Times New Roman" w:hAnsi="Times New Roman" w:cs="Times New Roman"/>
               </w:rPr>
-              <w:t xml:space="preserve">so the same codes </w:t>
-            </w:r>
-            <w:proofErr w:type="gramStart"/>
-            <w:r>
-              <w:rPr>
-                <w:rFonts w:ascii="Times New Roman" w:hAnsi="Times New Roman" w:cs="Times New Roman"/>
-              </w:rPr>
-              <w:t>compiles</w:t>
-            </w:r>
-            <w:proofErr w:type="gramEnd"/>
-            <w:r>
-              <w:rPr>
-                <w:rFonts w:ascii="Times New Roman" w:hAnsi="Times New Roman" w:cs="Times New Roman"/>
-              </w:rPr>
-              <w:t xml:space="preserve"> across all.</w:t>
+              <w:t>so the same codes compiles across all.</w:t>
             </w:r>
           </w:p>
         </w:tc>
@@ -13337,7 +12841,6 @@
                 <w:rFonts w:ascii="Times New Roman" w:hAnsi="Times New Roman" w:cs="Times New Roman"/>
               </w:rPr>
             </w:pPr>
-            <w:proofErr w:type="gramStart"/>
             <w:r>
               <w:rPr>
                 <w:rFonts w:ascii="Times New Roman" w:hAnsi="Times New Roman" w:cs="Times New Roman"/>
@@ -13354,14 +12857,7 @@
               <w:rPr>
                 <w:rFonts w:ascii="Times New Roman" w:hAnsi="Times New Roman" w:cs="Times New Roman"/>
               </w:rPr>
-              <w:t>is</w:t>
-            </w:r>
-            <w:proofErr w:type="gramEnd"/>
-            <w:r>
-              <w:rPr>
-                <w:rFonts w:ascii="Times New Roman" w:hAnsi="Times New Roman" w:cs="Times New Roman"/>
-              </w:rPr>
-              <w:t xml:space="preserve"> built, shuffled and questions are asked one by one.</w:t>
+              <w:t>is built, shuffled and questions are asked one by one.</w:t>
             </w:r>
           </w:p>
         </w:tc>
@@ -13583,35 +13079,7 @@
               <w:rPr>
                 <w:rFonts w:ascii="Times New Roman" w:hAnsi="Times New Roman" w:cs="Times New Roman"/>
               </w:rPr>
-              <w:t xml:space="preserve">All scores are </w:t>
-            </w:r>
-            <w:proofErr w:type="gramStart"/>
-            <w:r>
-              <w:rPr>
-                <w:rFonts w:ascii="Times New Roman" w:hAnsi="Times New Roman" w:cs="Times New Roman"/>
-              </w:rPr>
-              <w:t>read,</w:t>
-            </w:r>
-            <w:proofErr w:type="gramEnd"/>
-            <w:r>
-              <w:rPr>
-                <w:rFonts w:ascii="Times New Roman" w:hAnsi="Times New Roman" w:cs="Times New Roman"/>
-              </w:rPr>
-              <w:t xml:space="preserve"> sorted and the top 10 </w:t>
-            </w:r>
-            <w:proofErr w:type="gramStart"/>
-            <w:r>
-              <w:rPr>
-                <w:rFonts w:ascii="Times New Roman" w:hAnsi="Times New Roman" w:cs="Times New Roman"/>
-              </w:rPr>
-              <w:t>is</w:t>
-            </w:r>
-            <w:proofErr w:type="gramEnd"/>
-            <w:r>
-              <w:rPr>
-                <w:rFonts w:ascii="Times New Roman" w:hAnsi="Times New Roman" w:cs="Times New Roman"/>
-              </w:rPr>
-              <w:t xml:space="preserve"> shown.</w:t>
+              <w:t>All scores are read, sorted and the top 10 is shown.</w:t>
             </w:r>
           </w:p>
         </w:tc>
@@ -13670,7 +13138,6 @@
               <w:t xml:space="preserve">Loops back to main menu until game is </w:t>
             </w:r>
             <w:proofErr w:type="spellStart"/>
-            <w:proofErr w:type="gramStart"/>
             <w:r>
               <w:rPr>
                 <w:rFonts w:ascii="Times New Roman" w:hAnsi="Times New Roman" w:cs="Times New Roman"/>
@@ -13678,7 +13145,6 @@
               <w:t>exited</w:t>
             </w:r>
             <w:proofErr w:type="spellEnd"/>
-            <w:proofErr w:type="gramEnd"/>
             <w:r>
               <w:rPr>
                 <w:rFonts w:ascii="Times New Roman" w:hAnsi="Times New Roman" w:cs="Times New Roman"/>
@@ -13932,7 +13398,6 @@
         <w:t xml:space="preserve">) and a missing </w:t>
       </w:r>
       <w:proofErr w:type="spellStart"/>
-      <w:proofErr w:type="gramStart"/>
       <w:r>
         <w:rPr>
           <w:rFonts w:ascii="Times New Roman" w:hAnsi="Times New Roman" w:cs="Times New Roman"/>
@@ -13948,16 +13413,7 @@
           <w:sz w:val="28"/>
           <w:szCs w:val="28"/>
         </w:rPr>
-        <w:t>(</w:t>
-      </w:r>
-      <w:proofErr w:type="gramEnd"/>
-      <w:r>
-        <w:rPr>
-          <w:rFonts w:ascii="Times New Roman" w:hAnsi="Times New Roman" w:cs="Times New Roman"/>
-          <w:sz w:val="28"/>
-          <w:szCs w:val="28"/>
-        </w:rPr>
-        <w:t xml:space="preserve">) function that was declared in </w:t>
+        <w:t xml:space="preserve">() function that was declared in </w:t>
       </w:r>
       <w:proofErr w:type="spellStart"/>
       <w:r>
@@ -14182,7 +13638,7 @@
 </file>
 
 <file path=word/endnotes.xml><?xml version="1.0" encoding="utf-8"?>
-<w:endnotes xmlns:wpc="http://schemas.microsoft.com/office/word/2010/wordprocessingCanvas" xmlns:cx="http://schemas.microsoft.com/office/drawing/2014/chartex" xmlns:cx1="http://schemas.microsoft.com/office/drawing/2015/9/8/chartex" xmlns:cx2="http://schemas.microsoft.com/office/drawing/2015/10/21/chartex" xmlns:cx3="http://schemas.microsoft.com/office/drawing/2016/5/9/chartex" xmlns:cx4="http://schemas.microsoft.com/office/drawing/2016/5/10/chartex" xmlns:cx5="http://schemas.microsoft.com/office/drawing/2016/5/11/chartex" xmlns:cx6="http://schemas.microsoft.com/office/drawing/2016/5/12/chartex" xmlns:cx7="http://schemas.microsoft.com/office/drawing/2016/5/13/chartex" xmlns:cx8="http://schemas.microsoft.com/office/drawing/2016/5/14/chartex" xmlns:mc="http://schemas.openxmlformats.org/markup-compatibility/2006" xmlns:aink="http://schemas.microsoft.com/office/drawing/2016/ink" xmlns:am3d="http://schemas.microsoft.com/office/drawing/2017/model3d" xmlns:o="urn:schemas-microsoft-com:office:office" xmlns:oel="http://schemas.microsoft.com/office/2019/extlst" xmlns:r="http://schemas.openxmlformats.org/officeDocument/2006/relationships" xmlns:m="http://schemas.openxmlformats.org/officeDocument/2006/math" xmlns:v="urn:schemas-microsoft-com:vml" xmlns:wp14="http://schemas.microsoft.com/office/word/2010/wordprocessingDrawing" xmlns:wp="http://schemas.openxmlformats.org/drawingml/2006/wordprocessingDrawing" xmlns:w10="urn:schemas-microsoft-com:office:word" xmlns:w="http://schemas.openxmlformats.org/wordprocessingml/2006/main" xmlns:w14="http://schemas.microsoft.com/office/word/2010/wordml" xmlns:w15="http://schemas.microsoft.com/office/word/2012/wordml" xmlns:w16cex="http://schemas.microsoft.com/office/word/2018/wordml/cex" xmlns:w16cid="http://schemas.microsoft.com/office/word/2016/wordml/cid" xmlns:w16="http://schemas.microsoft.com/office/word/2018/wordml" xmlns:w16du="http://schemas.microsoft.com/office/word/2023/wordml/word16du" xmlns:w16sdtdh="http://schemas.microsoft.com/office/word/2020/wordml/sdtdatahash" xmlns:w16sdtfl="http://schemas.microsoft.com/office/word/2024/wordml/sdtformatlock" xmlns:w16se="http://schemas.microsoft.com/office/word/2015/wordml/symex" xmlns:wpg="http://schemas.microsoft.com/office/word/2010/wordprocessingGroup" xmlns:wpi="http://schemas.microsoft.com/office/word/2010/wordprocessingInk" xmlns:wne="http://schemas.microsoft.com/office/word/2006/wordml" xmlns:wps="http://schemas.microsoft.com/office/word/2010/wordprocessingShape" mc:Ignorable="w14 w15 w16se w16cid w16 w16cex w16sdtdh w16sdtfl w16du wp14">
+<w:endnotes xmlns:wpc="http://schemas.microsoft.com/office/word/2010/wordprocessingCanvas" xmlns:cx="http://schemas.microsoft.com/office/drawing/2014/chartex" xmlns:cx1="http://schemas.microsoft.com/office/drawing/2015/9/8/chartex" xmlns:cx2="http://schemas.microsoft.com/office/drawing/2015/10/21/chartex" xmlns:cx3="http://schemas.microsoft.com/office/drawing/2016/5/9/chartex" xmlns:cx4="http://schemas.microsoft.com/office/drawing/2016/5/10/chartex" xmlns:cx5="http://schemas.microsoft.com/office/drawing/2016/5/11/chartex" xmlns:cx6="http://schemas.microsoft.com/office/drawing/2016/5/12/chartex" xmlns:cx7="http://schemas.microsoft.com/office/drawing/2016/5/13/chartex" xmlns:cx8="http://schemas.microsoft.com/office/drawing/2016/5/14/chartex" xmlns:mc="http://schemas.openxmlformats.org/markup-compatibility/2006" xmlns:aink="http://schemas.microsoft.com/office/drawing/2016/ink" xmlns:am3d="http://schemas.microsoft.com/office/drawing/2017/model3d" xmlns:o="urn:schemas-microsoft-com:office:office" xmlns:oel="http://schemas.microsoft.com/office/2019/extlst" xmlns:r="http://schemas.openxmlformats.org/officeDocument/2006/relationships" xmlns:m="http://schemas.openxmlformats.org/officeDocument/2006/math" xmlns:v="urn:schemas-microsoft-com:vml" xmlns:wp14="http://schemas.microsoft.com/office/word/2010/wordprocessingDrawing" xmlns:wp="http://schemas.openxmlformats.org/drawingml/2006/wordprocessingDrawing" xmlns:w10="urn:schemas-microsoft-com:office:word" xmlns:w="http://schemas.openxmlformats.org/wordprocessingml/2006/main" xmlns:w14="http://schemas.microsoft.com/office/word/2010/wordml" xmlns:w15="http://schemas.microsoft.com/office/word/2012/wordml" xmlns:w16cex="http://schemas.microsoft.com/office/word/2018/wordml/cex" xmlns:w16cid="http://schemas.microsoft.com/office/word/2016/wordml/cid" xmlns:w16="http://schemas.microsoft.com/office/word/2018/wordml" xmlns:w16sdtdh="http://schemas.microsoft.com/office/word/2020/wordml/sdtdatahash" xmlns:w16se="http://schemas.microsoft.com/office/word/2015/wordml/symex" xmlns:wpg="http://schemas.microsoft.com/office/word/2010/wordprocessingGroup" xmlns:wpi="http://schemas.microsoft.com/office/word/2010/wordprocessingInk" xmlns:wne="http://schemas.microsoft.com/office/word/2006/wordml" xmlns:wps="http://schemas.microsoft.com/office/word/2010/wordprocessingShape" mc:Ignorable="w14 w15 w16se w16cid w16 w16cex w16sdtdh wp14">
   <w:endnote w:type="separator" w:id="-1">
     <w:p>
       <w:pPr>
@@ -14207,7 +13663,7 @@
 </file>
 
 <file path=word/footnotes.xml><?xml version="1.0" encoding="utf-8"?>
-<w:footnotes xmlns:wpc="http://schemas.microsoft.com/office/word/2010/wordprocessingCanvas" xmlns:cx="http://schemas.microsoft.com/office/drawing/2014/chartex" xmlns:cx1="http://schemas.microsoft.com/office/drawing/2015/9/8/chartex" xmlns:cx2="http://schemas.microsoft.com/office/drawing/2015/10/21/chartex" xmlns:cx3="http://schemas.microsoft.com/office/drawing/2016/5/9/chartex" xmlns:cx4="http://schemas.microsoft.com/office/drawing/2016/5/10/chartex" xmlns:cx5="http://schemas.microsoft.com/office/drawing/2016/5/11/chartex" xmlns:cx6="http://schemas.microsoft.com/office/drawing/2016/5/12/chartex" xmlns:cx7="http://schemas.microsoft.com/office/drawing/2016/5/13/chartex" xmlns:cx8="http://schemas.microsoft.com/office/drawing/2016/5/14/chartex" xmlns:mc="http://schemas.openxmlformats.org/markup-compatibility/2006" xmlns:aink="http://schemas.microsoft.com/office/drawing/2016/ink" xmlns:am3d="http://schemas.microsoft.com/office/drawing/2017/model3d" xmlns:o="urn:schemas-microsoft-com:office:office" xmlns:oel="http://schemas.microsoft.com/office/2019/extlst" xmlns:r="http://schemas.openxmlformats.org/officeDocument/2006/relationships" xmlns:m="http://schemas.openxmlformats.org/officeDocument/2006/math" xmlns:v="urn:schemas-microsoft-com:vml" xmlns:wp14="http://schemas.microsoft.com/office/word/2010/wordprocessingDrawing" xmlns:wp="http://schemas.openxmlformats.org/drawingml/2006/wordprocessingDrawing" xmlns:w10="urn:schemas-microsoft-com:office:word" xmlns:w="http://schemas.openxmlformats.org/wordprocessingml/2006/main" xmlns:w14="http://schemas.microsoft.com/office/word/2010/wordml" xmlns:w15="http://schemas.microsoft.com/office/word/2012/wordml" xmlns:w16cex="http://schemas.microsoft.com/office/word/2018/wordml/cex" xmlns:w16cid="http://schemas.microsoft.com/office/word/2016/wordml/cid" xmlns:w16="http://schemas.microsoft.com/office/word/2018/wordml" xmlns:w16du="http://schemas.microsoft.com/office/word/2023/wordml/word16du" xmlns:w16sdtdh="http://schemas.microsoft.com/office/word/2020/wordml/sdtdatahash" xmlns:w16sdtfl="http://schemas.microsoft.com/office/word/2024/wordml/sdtformatlock" xmlns:w16se="http://schemas.microsoft.com/office/word/2015/wordml/symex" xmlns:wpg="http://schemas.microsoft.com/office/word/2010/wordprocessingGroup" xmlns:wpi="http://schemas.microsoft.com/office/word/2010/wordprocessingInk" xmlns:wne="http://schemas.microsoft.com/office/word/2006/wordml" xmlns:wps="http://schemas.microsoft.com/office/word/2010/wordprocessingShape" mc:Ignorable="w14 w15 w16se w16cid w16 w16cex w16sdtdh w16sdtfl w16du wp14">
+<w:footnotes xmlns:wpc="http://schemas.microsoft.com/office/word/2010/wordprocessingCanvas" xmlns:cx="http://schemas.microsoft.com/office/drawing/2014/chartex" xmlns:cx1="http://schemas.microsoft.com/office/drawing/2015/9/8/chartex" xmlns:cx2="http://schemas.microsoft.com/office/drawing/2015/10/21/chartex" xmlns:cx3="http://schemas.microsoft.com/office/drawing/2016/5/9/chartex" xmlns:cx4="http://schemas.microsoft.com/office/drawing/2016/5/10/chartex" xmlns:cx5="http://schemas.microsoft.com/office/drawing/2016/5/11/chartex" xmlns:cx6="http://schemas.microsoft.com/office/drawing/2016/5/12/chartex" xmlns:cx7="http://schemas.microsoft.com/office/drawing/2016/5/13/chartex" xmlns:cx8="http://schemas.microsoft.com/office/drawing/2016/5/14/chartex" xmlns:mc="http://schemas.openxmlformats.org/markup-compatibility/2006" xmlns:aink="http://schemas.microsoft.com/office/drawing/2016/ink" xmlns:am3d="http://schemas.microsoft.com/office/drawing/2017/model3d" xmlns:o="urn:schemas-microsoft-com:office:office" xmlns:oel="http://schemas.microsoft.com/office/2019/extlst" xmlns:r="http://schemas.openxmlformats.org/officeDocument/2006/relationships" xmlns:m="http://schemas.openxmlformats.org/officeDocument/2006/math" xmlns:v="urn:schemas-microsoft-com:vml" xmlns:wp14="http://schemas.microsoft.com/office/word/2010/wordprocessingDrawing" xmlns:wp="http://schemas.openxmlformats.org/drawingml/2006/wordprocessingDrawing" xmlns:w10="urn:schemas-microsoft-com:office:word" xmlns:w="http://schemas.openxmlformats.org/wordprocessingml/2006/main" xmlns:w14="http://schemas.microsoft.com/office/word/2010/wordml" xmlns:w15="http://schemas.microsoft.com/office/word/2012/wordml" xmlns:w16cex="http://schemas.microsoft.com/office/word/2018/wordml/cex" xmlns:w16cid="http://schemas.microsoft.com/office/word/2016/wordml/cid" xmlns:w16="http://schemas.microsoft.com/office/word/2018/wordml" xmlns:w16sdtdh="http://schemas.microsoft.com/office/word/2020/wordml/sdtdatahash" xmlns:w16se="http://schemas.microsoft.com/office/word/2015/wordml/symex" xmlns:wpg="http://schemas.microsoft.com/office/word/2010/wordprocessingGroup" xmlns:wpi="http://schemas.microsoft.com/office/word/2010/wordprocessingInk" xmlns:wne="http://schemas.microsoft.com/office/word/2006/wordml" xmlns:wps="http://schemas.microsoft.com/office/word/2010/wordprocessingShape" mc:Ignorable="w14 w15 w16se w16cid w16 w16cex w16sdtdh wp14">
   <w:footnote w:type="separator" w:id="-1">
     <w:p>
       <w:pPr>
@@ -14232,7 +13688,7 @@
 </file>
 
 <file path=word/header1.xml><?xml version="1.0" encoding="utf-8"?>
-<w:hdr xmlns:wpc="http://schemas.microsoft.com/office/word/2010/wordprocessingCanvas" xmlns:cx="http://schemas.microsoft.com/office/drawing/2014/chartex" xmlns:cx1="http://schemas.microsoft.com/office/drawing/2015/9/8/chartex" xmlns:cx2="http://schemas.microsoft.com/office/drawing/2015/10/21/chartex" xmlns:cx3="http://schemas.microsoft.com/office/drawing/2016/5/9/chartex" xmlns:cx4="http://schemas.microsoft.com/office/drawing/2016/5/10/chartex" xmlns:cx5="http://schemas.microsoft.com/office/drawing/2016/5/11/chartex" xmlns:cx6="http://schemas.microsoft.com/office/drawing/2016/5/12/chartex" xmlns:cx7="http://schemas.microsoft.com/office/drawing/2016/5/13/chartex" xmlns:cx8="http://schemas.microsoft.com/office/drawing/2016/5/14/chartex" xmlns:mc="http://schemas.openxmlformats.org/markup-compatibility/2006" xmlns:aink="http://schemas.microsoft.com/office/drawing/2016/ink" xmlns:am3d="http://schemas.microsoft.com/office/drawing/2017/model3d" xmlns:o="urn:schemas-microsoft-com:office:office" xmlns:oel="http://schemas.microsoft.com/office/2019/extlst" xmlns:r="http://schemas.openxmlformats.org/officeDocument/2006/relationships" xmlns:m="http://schemas.openxmlformats.org/officeDocument/2006/math" xmlns:v="urn:schemas-microsoft-com:vml" xmlns:wp14="http://schemas.microsoft.com/office/word/2010/wordprocessingDrawing" xmlns:wp="http://schemas.openxmlformats.org/drawingml/2006/wordprocessingDrawing" xmlns:w10="urn:schemas-microsoft-com:office:word" xmlns:w="http://schemas.openxmlformats.org/wordprocessingml/2006/main" xmlns:w14="http://schemas.microsoft.com/office/word/2010/wordml" xmlns:w15="http://schemas.microsoft.com/office/word/2012/wordml" xmlns:w16cex="http://schemas.microsoft.com/office/word/2018/wordml/cex" xmlns:w16cid="http://schemas.microsoft.com/office/word/2016/wordml/cid" xmlns:w16="http://schemas.microsoft.com/office/word/2018/wordml" xmlns:w16du="http://schemas.microsoft.com/office/word/2023/wordml/word16du" xmlns:w16sdtdh="http://schemas.microsoft.com/office/word/2020/wordml/sdtdatahash" xmlns:w16sdtfl="http://schemas.microsoft.com/office/word/2024/wordml/sdtformatlock" xmlns:w16se="http://schemas.microsoft.com/office/word/2015/wordml/symex" xmlns:wpg="http://schemas.microsoft.com/office/word/2010/wordprocessingGroup" xmlns:wpi="http://schemas.microsoft.com/office/word/2010/wordprocessingInk" xmlns:wne="http://schemas.microsoft.com/office/word/2006/wordml" xmlns:wps="http://schemas.microsoft.com/office/word/2010/wordprocessingShape" mc:Ignorable="w14 w15 w16se w16cid w16 w16cex w16sdtdh w16sdtfl w16du wp14">
+<w:hdr xmlns:wpc="http://schemas.microsoft.com/office/word/2010/wordprocessingCanvas" xmlns:cx="http://schemas.microsoft.com/office/drawing/2014/chartex" xmlns:cx1="http://schemas.microsoft.com/office/drawing/2015/9/8/chartex" xmlns:cx2="http://schemas.microsoft.com/office/drawing/2015/10/21/chartex" xmlns:cx3="http://schemas.microsoft.com/office/drawing/2016/5/9/chartex" xmlns:cx4="http://schemas.microsoft.com/office/drawing/2016/5/10/chartex" xmlns:cx5="http://schemas.microsoft.com/office/drawing/2016/5/11/chartex" xmlns:cx6="http://schemas.microsoft.com/office/drawing/2016/5/12/chartex" xmlns:cx7="http://schemas.microsoft.com/office/drawing/2016/5/13/chartex" xmlns:cx8="http://schemas.microsoft.com/office/drawing/2016/5/14/chartex" xmlns:mc="http://schemas.openxmlformats.org/markup-compatibility/2006" xmlns:aink="http://schemas.microsoft.com/office/drawing/2016/ink" xmlns:am3d="http://schemas.microsoft.com/office/drawing/2017/model3d" xmlns:o="urn:schemas-microsoft-com:office:office" xmlns:oel="http://schemas.microsoft.com/office/2019/extlst" xmlns:r="http://schemas.openxmlformats.org/officeDocument/2006/relationships" xmlns:m="http://schemas.openxmlformats.org/officeDocument/2006/math" xmlns:v="urn:schemas-microsoft-com:vml" xmlns:wp14="http://schemas.microsoft.com/office/word/2010/wordprocessingDrawing" xmlns:wp="http://schemas.openxmlformats.org/drawingml/2006/wordprocessingDrawing" xmlns:w10="urn:schemas-microsoft-com:office:word" xmlns:w="http://schemas.openxmlformats.org/wordprocessingml/2006/main" xmlns:w14="http://schemas.microsoft.com/office/word/2010/wordml" xmlns:w15="http://schemas.microsoft.com/office/word/2012/wordml" xmlns:w16cex="http://schemas.microsoft.com/office/word/2018/wordml/cex" xmlns:w16cid="http://schemas.microsoft.com/office/word/2016/wordml/cid" xmlns:w16="http://schemas.microsoft.com/office/word/2018/wordml" xmlns:w16sdtdh="http://schemas.microsoft.com/office/word/2020/wordml/sdtdatahash" xmlns:w16se="http://schemas.microsoft.com/office/word/2015/wordml/symex" xmlns:wpg="http://schemas.microsoft.com/office/word/2010/wordprocessingGroup" xmlns:wpi="http://schemas.microsoft.com/office/word/2010/wordprocessingInk" xmlns:wne="http://schemas.microsoft.com/office/word/2006/wordml" xmlns:wps="http://schemas.microsoft.com/office/word/2010/wordprocessingShape" mc:Ignorable="w14 w15 w16se w16cid w16 w16cex w16sdtdh wp14">
   <w:p>
     <w:pPr>
       <w:pStyle w:val="Header"/>
@@ -14249,7 +13705,7 @@
 </file>
 
 <file path=word/numbering.xml><?xml version="1.0" encoding="utf-8"?>
-<w:numbering xmlns:wpc="http://schemas.microsoft.com/office/word/2010/wordprocessingCanvas" xmlns:cx="http://schemas.microsoft.com/office/drawing/2014/chartex" xmlns:cx1="http://schemas.microsoft.com/office/drawing/2015/9/8/chartex" xmlns:cx2="http://schemas.microsoft.com/office/drawing/2015/10/21/chartex" xmlns:cx3="http://schemas.microsoft.com/office/drawing/2016/5/9/chartex" xmlns:cx4="http://schemas.microsoft.com/office/drawing/2016/5/10/chartex" xmlns:cx5="http://schemas.microsoft.com/office/drawing/2016/5/11/chartex" xmlns:cx6="http://schemas.microsoft.com/office/drawing/2016/5/12/chartex" xmlns:cx7="http://schemas.microsoft.com/office/drawing/2016/5/13/chartex" xmlns:cx8="http://schemas.microsoft.com/office/drawing/2016/5/14/chartex" xmlns:mc="http://schemas.openxmlformats.org/markup-compatibility/2006" xmlns:aink="http://schemas.microsoft.com/office/drawing/2016/ink" xmlns:am3d="http://schemas.microsoft.com/office/drawing/2017/model3d" xmlns:o="urn:schemas-microsoft-com:office:office" xmlns:oel="http://schemas.microsoft.com/office/2019/extlst" xmlns:r="http://schemas.openxmlformats.org/officeDocument/2006/relationships" xmlns:m="http://schemas.openxmlformats.org/officeDocument/2006/math" xmlns:v="urn:schemas-microsoft-com:vml" xmlns:wp14="http://schemas.microsoft.com/office/word/2010/wordprocessingDrawing" xmlns:wp="http://schemas.openxmlformats.org/drawingml/2006/wordprocessingDrawing" xmlns:w10="urn:schemas-microsoft-com:office:word" xmlns:w="http://schemas.openxmlformats.org/wordprocessingml/2006/main" xmlns:w14="http://schemas.microsoft.com/office/word/2010/wordml" xmlns:w15="http://schemas.microsoft.com/office/word/2012/wordml" xmlns:w16cex="http://schemas.microsoft.com/office/word/2018/wordml/cex" xmlns:w16cid="http://schemas.microsoft.com/office/word/2016/wordml/cid" xmlns:w16="http://schemas.microsoft.com/office/word/2018/wordml" xmlns:w16du="http://schemas.microsoft.com/office/word/2023/wordml/word16du" xmlns:w16sdtdh="http://schemas.microsoft.com/office/word/2020/wordml/sdtdatahash" xmlns:w16sdtfl="http://schemas.microsoft.com/office/word/2024/wordml/sdtformatlock" xmlns:w16se="http://schemas.microsoft.com/office/word/2015/wordml/symex" xmlns:wpg="http://schemas.microsoft.com/office/word/2010/wordprocessingGroup" xmlns:wpi="http://schemas.microsoft.com/office/word/2010/wordprocessingInk" xmlns:wne="http://schemas.microsoft.com/office/word/2006/wordml" xmlns:wps="http://schemas.microsoft.com/office/word/2010/wordprocessingShape" mc:Ignorable="w14 w15 w16se w16cid w16 w16cex w16sdtdh w16sdtfl w16du wp14">
+<w:numbering xmlns:wpc="http://schemas.microsoft.com/office/word/2010/wordprocessingCanvas" xmlns:cx="http://schemas.microsoft.com/office/drawing/2014/chartex" xmlns:cx1="http://schemas.microsoft.com/office/drawing/2015/9/8/chartex" xmlns:cx2="http://schemas.microsoft.com/office/drawing/2015/10/21/chartex" xmlns:cx3="http://schemas.microsoft.com/office/drawing/2016/5/9/chartex" xmlns:cx4="http://schemas.microsoft.com/office/drawing/2016/5/10/chartex" xmlns:cx5="http://schemas.microsoft.com/office/drawing/2016/5/11/chartex" xmlns:cx6="http://schemas.microsoft.com/office/drawing/2016/5/12/chartex" xmlns:cx7="http://schemas.microsoft.com/office/drawing/2016/5/13/chartex" xmlns:cx8="http://schemas.microsoft.com/office/drawing/2016/5/14/chartex" xmlns:mc="http://schemas.openxmlformats.org/markup-compatibility/2006" xmlns:aink="http://schemas.microsoft.com/office/drawing/2016/ink" xmlns:am3d="http://schemas.microsoft.com/office/drawing/2017/model3d" xmlns:o="urn:schemas-microsoft-com:office:office" xmlns:oel="http://schemas.microsoft.com/office/2019/extlst" xmlns:r="http://schemas.openxmlformats.org/officeDocument/2006/relationships" xmlns:m="http://schemas.openxmlformats.org/officeDocument/2006/math" xmlns:v="urn:schemas-microsoft-com:vml" xmlns:wp14="http://schemas.microsoft.com/office/word/2010/wordprocessingDrawing" xmlns:wp="http://schemas.openxmlformats.org/drawingml/2006/wordprocessingDrawing" xmlns:w10="urn:schemas-microsoft-com:office:word" xmlns:w="http://schemas.openxmlformats.org/wordprocessingml/2006/main" xmlns:w14="http://schemas.microsoft.com/office/word/2010/wordml" xmlns:w15="http://schemas.microsoft.com/office/word/2012/wordml" xmlns:w16cex="http://schemas.microsoft.com/office/word/2018/wordml/cex" xmlns:w16cid="http://schemas.microsoft.com/office/word/2016/wordml/cid" xmlns:w16="http://schemas.microsoft.com/office/word/2018/wordml" xmlns:w16sdtdh="http://schemas.microsoft.com/office/word/2020/wordml/sdtdatahash" xmlns:w16se="http://schemas.microsoft.com/office/word/2015/wordml/symex" xmlns:wpg="http://schemas.microsoft.com/office/word/2010/wordprocessingGroup" xmlns:wpi="http://schemas.microsoft.com/office/word/2010/wordprocessingInk" xmlns:wne="http://schemas.microsoft.com/office/word/2006/wordml" xmlns:wps="http://schemas.microsoft.com/office/word/2010/wordprocessingShape" mc:Ignorable="w14 w15 w16se w16cid w16 w16cex w16sdtdh wp14">
   <w:abstractNum w:abstractNumId="0" w15:restartNumberingAfterBreak="0">
     <w:nsid w:val="1EA6706D"/>
     <w:multiLevelType w:val="hybridMultilevel"/>
@@ -15360,7 +14816,7 @@
 </file>
 
 <file path=word/styles.xml><?xml version="1.0" encoding="utf-8"?>
-<w:styles xmlns:mc="http://schemas.openxmlformats.org/markup-compatibility/2006" xmlns:r="http://schemas.openxmlformats.org/officeDocument/2006/relationships" xmlns:w="http://schemas.openxmlformats.org/wordprocessingml/2006/main" xmlns:w14="http://schemas.microsoft.com/office/word/2010/wordml" xmlns:w15="http://schemas.microsoft.com/office/word/2012/wordml" xmlns:w16cex="http://schemas.microsoft.com/office/word/2018/wordml/cex" xmlns:w16cid="http://schemas.microsoft.com/office/word/2016/wordml/cid" xmlns:w16="http://schemas.microsoft.com/office/word/2018/wordml" xmlns:w16du="http://schemas.microsoft.com/office/word/2023/wordml/word16du" xmlns:w16sdtdh="http://schemas.microsoft.com/office/word/2020/wordml/sdtdatahash" xmlns:w16sdtfl="http://schemas.microsoft.com/office/word/2024/wordml/sdtformatlock" xmlns:w16se="http://schemas.microsoft.com/office/word/2015/wordml/symex" mc:Ignorable="w14 w15 w16se w16cid w16 w16cex w16sdtdh w16sdtfl w16du">
+<w:styles xmlns:mc="http://schemas.openxmlformats.org/markup-compatibility/2006" xmlns:r="http://schemas.openxmlformats.org/officeDocument/2006/relationships" xmlns:w="http://schemas.openxmlformats.org/wordprocessingml/2006/main" xmlns:w14="http://schemas.microsoft.com/office/word/2010/wordml" xmlns:w15="http://schemas.microsoft.com/office/word/2012/wordml" xmlns:w16cex="http://schemas.microsoft.com/office/word/2018/wordml/cex" xmlns:w16cid="http://schemas.microsoft.com/office/word/2016/wordml/cid" xmlns:w16="http://schemas.microsoft.com/office/word/2018/wordml" xmlns:w16sdtdh="http://schemas.microsoft.com/office/word/2020/wordml/sdtdatahash" xmlns:w16se="http://schemas.microsoft.com/office/word/2015/wordml/symex" mc:Ignorable="w14 w15 w16se w16cid w16 w16cex w16sdtdh">
   <w:docDefaults>
     <w:rPrDefault>
       <w:rPr>

</xml_diff>